<commit_message>
checkpoint: add retirement and board badge examples
</commit_message>
<xml_diff>
--- a/templates/conga-badge-template.docx
+++ b/templates/conga-badge-template.docx
@@ -100,6 +100,97 @@
                 <w:szCs w:val="30"/>
               </w:rPr>
               <w:t xml:space="preserve">{{PRIMARY_AFFILIATION_CONGA_FIELD}}</w:t>
+            </w:r>
+            <w:r>
+              <w:rPr>
+                <w:rFonts w:ascii="Arial" w:hAnsi="Arial" w:cs="Arial"/>
+                <w:sz w:val="30"/>
+                <w:szCs w:val="30"/>
+              </w:rPr>
+              <w:fldChar w:fldCharType="end"/>
+            </w:r>
+            <w:r>
+              <w:rPr>
+                <w:rFonts w:ascii="Arial" w:hAnsi="Arial" w:cs="Arial"/>
+                <w:sz w:val="30"/>
+                <w:szCs w:val="30"/>
+              </w:rPr>
+              <w:fldChar w:fldCharType="begin"/>
+            </w:r>
+            <w:r>
+              <w:rPr>
+                <w:rFonts w:ascii="Arial" w:hAnsi="Arial" w:cs="Arial"/>
+                <w:sz w:val="30"/>
+                <w:szCs w:val="30"/>
+              </w:rPr>
+              <w:instrText xml:space="preserve"> IF "{{RETIRED_STATUS_CONGA_FIELD}}" = "True" " (Retired)" "" </w:instrText>
+            </w:r>
+            <w:r>
+              <w:rPr>
+                <w:rFonts w:ascii="Arial" w:hAnsi="Arial" w:cs="Arial"/>
+                <w:sz w:val="30"/>
+                <w:szCs w:val="30"/>
+              </w:rPr>
+              <w:fldChar w:fldCharType="separate"/>
+            </w:r>
+            <w:r>
+              <w:rPr>
+                <w:rFonts w:ascii="Arial" w:hAnsi="Arial" w:cs="Arial"/>
+                <w:sz w:val="30"/>
+                <w:szCs w:val="30"/>
+              </w:rPr>
+              <w:t xml:space="preserve">{{RETIRED_STATUS_CONGA_FIELD}}</w:t>
+            </w:r>
+            <w:r>
+              <w:rPr>
+                <w:rFonts w:ascii="Arial" w:hAnsi="Arial" w:cs="Arial"/>
+                <w:sz w:val="30"/>
+                <w:szCs w:val="30"/>
+              </w:rPr>
+              <w:fldChar w:fldCharType="end"/>
+            </w:r>
+          </w:p>
+          <w:p>
+            <w:pPr>
+              <w:spacing w:before="0" w:after="0" w:line="240" w:lineRule="auto"/>
+              <w:jc w:val="center"/>
+              <w:rPr>
+                <w:rFonts w:ascii="Arial" w:hAnsi="Arial" w:cs="Arial"/>
+                <w:sz w:val="30"/>
+                <w:szCs w:val="30"/>
+              </w:rPr>
+            </w:pPr>
+            <w:r>
+              <w:rPr>
+                <w:rFonts w:ascii="Arial" w:hAnsi="Arial" w:cs="Arial"/>
+                <w:sz w:val="30"/>
+                <w:szCs w:val="30"/>
+              </w:rPr>
+              <w:fldChar w:fldCharType="begin"/>
+            </w:r>
+            <w:r>
+              <w:rPr>
+                <w:rFonts w:ascii="Arial" w:hAnsi="Arial" w:cs="Arial"/>
+                <w:sz w:val="30"/>
+                <w:szCs w:val="30"/>
+              </w:rPr>
+              <w:instrText xml:space="preserve"> IF "{{BOARD_AFFILIATIONS_CONGA_FIELD}}" = "" "" "{{BOARD_AFFILIATIONS_CONGA_FIELD}}" </w:instrText>
+            </w:r>
+            <w:r>
+              <w:rPr>
+                <w:rFonts w:ascii="Arial" w:hAnsi="Arial" w:cs="Arial"/>
+                <w:sz w:val="30"/>
+                <w:szCs w:val="30"/>
+              </w:rPr>
+              <w:fldChar w:fldCharType="separate"/>
+            </w:r>
+            <w:r>
+              <w:rPr>
+                <w:rFonts w:ascii="Arial" w:hAnsi="Arial" w:cs="Arial"/>
+                <w:sz w:val="30"/>
+                <w:szCs w:val="30"/>
+              </w:rPr>
+              <w:t xml:space="preserve">{{BOARD_AFFILIATIONS_CONGA_FIELD}}</w:t>
             </w:r>
             <w:r>
               <w:rPr>

</xml_diff>